<commit_message>
Stop presenting pythonocc-core as confirmed; it was our own pick
pythonocc-core was our own research recommendation, never actually
confirmed by the mentor. The mentor's slide said "FreeCAD-python
API" and the school's AI Lab server guide separately said
"cadquery" - neither matches what our docs had been calling
settled. Update NFRD (bump to 1.3), HLD (bump to 1.1, regenerate
diagrams), architecture.md, step_library_comparison.md, and README
so only the OCCT-based approach (no NX) is shown as confirmed, and
the exact library binding is explicitly marked TBD pending mentor
clarification. Also fixed team member name-order consistency across
docs.
</commit_message>
<xml_diff>
--- a/docs/High_Level_Design_Document.docx
+++ b/docs/High_Level_Design_Document.docx
@@ -59,7 +59,7 @@
         <w:t xml:space="preserve">Team members: </w:t>
       </w:r>
       <w:r>
-        <w:t xml:space="preserve">Junoh Lee (Team Lead), Vangala Hemanth Reddy, Tahir Aneela, Balcha Kidus Elias</w:t>
+        <w:t xml:space="preserve">Junoh Lee (Team Lead), Hemanth Reddy Vangala, Aneela Tahir, Balcha Kidus Elias</w:t>
       </w:r>
     </w:p>
     <w:p>
@@ -109,10 +109,10 @@
             </w:tcBorders>
             <w:shd w:fill="D9D9D9" w:val="clear"/>
             <w:tcMar>
-              <w:top w:type="dxa" w:w="80"/>
-              <w:left w:type="dxa" w:w="100"/>
-              <w:bottom w:type="dxa" w:w="80"/>
-              <w:right w:type="dxa" w:w="100"/>
+              <w:top w:type="dxa" w:w="90"/>
+              <w:left w:type="dxa" w:w="110"/>
+              <w:bottom w:type="dxa" w:w="90"/>
+              <w:right w:type="dxa" w:w="110"/>
             </w:tcMar>
             <w:vAlign w:val="center"/>
           </w:tcPr>
@@ -142,10 +142,10 @@
             </w:tcBorders>
             <w:shd w:fill="D9D9D9" w:val="clear"/>
             <w:tcMar>
-              <w:top w:type="dxa" w:w="80"/>
-              <w:left w:type="dxa" w:w="100"/>
-              <w:bottom w:type="dxa" w:w="80"/>
-              <w:right w:type="dxa" w:w="100"/>
+              <w:top w:type="dxa" w:w="90"/>
+              <w:left w:type="dxa" w:w="110"/>
+              <w:bottom w:type="dxa" w:w="90"/>
+              <w:right w:type="dxa" w:w="110"/>
             </w:tcMar>
             <w:vAlign w:val="center"/>
           </w:tcPr>
@@ -175,10 +175,10 @@
             </w:tcBorders>
             <w:shd w:fill="D9D9D9" w:val="clear"/>
             <w:tcMar>
-              <w:top w:type="dxa" w:w="80"/>
-              <w:left w:type="dxa" w:w="100"/>
-              <w:bottom w:type="dxa" w:w="80"/>
-              <w:right w:type="dxa" w:w="100"/>
+              <w:top w:type="dxa" w:w="90"/>
+              <w:left w:type="dxa" w:w="110"/>
+              <w:bottom w:type="dxa" w:w="90"/>
+              <w:right w:type="dxa" w:w="110"/>
             </w:tcMar>
             <w:vAlign w:val="center"/>
           </w:tcPr>
@@ -208,10 +208,10 @@
             </w:tcBorders>
             <w:shd w:fill="D9D9D9" w:val="clear"/>
             <w:tcMar>
-              <w:top w:type="dxa" w:w="80"/>
-              <w:left w:type="dxa" w:w="100"/>
-              <w:bottom w:type="dxa" w:w="80"/>
-              <w:right w:type="dxa" w:w="100"/>
+              <w:top w:type="dxa" w:w="90"/>
+              <w:left w:type="dxa" w:w="110"/>
+              <w:bottom w:type="dxa" w:w="90"/>
+              <w:right w:type="dxa" w:w="110"/>
             </w:tcMar>
             <w:vAlign w:val="center"/>
           </w:tcPr>
@@ -242,10 +242,10 @@
               <w:right w:val="single" w:color="000000" w:sz="4"/>
             </w:tcBorders>
             <w:tcMar>
-              <w:top w:type="dxa" w:w="80"/>
-              <w:left w:type="dxa" w:w="100"/>
-              <w:bottom w:type="dxa" w:w="80"/>
-              <w:right w:type="dxa" w:w="100"/>
+              <w:top w:type="dxa" w:w="90"/>
+              <w:left w:type="dxa" w:w="110"/>
+              <w:bottom w:type="dxa" w:w="90"/>
+              <w:right w:type="dxa" w:w="110"/>
             </w:tcMar>
             <w:vAlign w:val="center"/>
           </w:tcPr>
@@ -274,10 +274,10 @@
               <w:right w:val="single" w:color="000000" w:sz="4"/>
             </w:tcBorders>
             <w:tcMar>
-              <w:top w:type="dxa" w:w="80"/>
-              <w:left w:type="dxa" w:w="100"/>
-              <w:bottom w:type="dxa" w:w="80"/>
-              <w:right w:type="dxa" w:w="100"/>
+              <w:top w:type="dxa" w:w="90"/>
+              <w:left w:type="dxa" w:w="110"/>
+              <w:bottom w:type="dxa" w:w="90"/>
+              <w:right w:type="dxa" w:w="110"/>
             </w:tcMar>
             <w:vAlign w:val="center"/>
           </w:tcPr>
@@ -306,10 +306,10 @@
               <w:right w:val="single" w:color="000000" w:sz="4"/>
             </w:tcBorders>
             <w:tcMar>
-              <w:top w:type="dxa" w:w="80"/>
-              <w:left w:type="dxa" w:w="100"/>
-              <w:bottom w:type="dxa" w:w="80"/>
-              <w:right w:type="dxa" w:w="100"/>
+              <w:top w:type="dxa" w:w="90"/>
+              <w:left w:type="dxa" w:w="110"/>
+              <w:bottom w:type="dxa" w:w="90"/>
+              <w:right w:type="dxa" w:w="110"/>
             </w:tcMar>
             <w:vAlign w:val="center"/>
           </w:tcPr>
@@ -338,10 +338,10 @@
               <w:right w:val="single" w:color="000000" w:sz="4"/>
             </w:tcBorders>
             <w:tcMar>
-              <w:top w:type="dxa" w:w="80"/>
-              <w:left w:type="dxa" w:w="100"/>
-              <w:bottom w:type="dxa" w:w="80"/>
-              <w:right w:type="dxa" w:w="100"/>
+              <w:top w:type="dxa" w:w="90"/>
+              <w:left w:type="dxa" w:w="110"/>
+              <w:bottom w:type="dxa" w:w="90"/>
+              <w:right w:type="dxa" w:w="110"/>
             </w:tcMar>
             <w:vAlign w:val="center"/>
           </w:tcPr>
@@ -357,6 +357,136 @@
                 <w:szCs w:val="19"/>
               </w:rPr>
               <w:t xml:space="preserve">1.0</w:t>
+            </w:r>
+          </w:p>
+        </w:tc>
+      </w:tr>
+      <w:tr>
+        <w:tc>
+          <w:tcPr>
+            <w:tcW w:type="dxa" w:w="2059"/>
+            <w:tcBorders>
+              <w:top w:val="single" w:color="000000" w:sz="4"/>
+              <w:left w:val="single" w:color="000000" w:sz="4"/>
+              <w:bottom w:val="single" w:color="000000" w:sz="4"/>
+              <w:right w:val="single" w:color="000000" w:sz="4"/>
+            </w:tcBorders>
+            <w:tcMar>
+              <w:top w:type="dxa" w:w="90"/>
+              <w:left w:type="dxa" w:w="110"/>
+              <w:bottom w:type="dxa" w:w="90"/>
+              <w:right w:type="dxa" w:w="110"/>
+            </w:tcMar>
+            <w:vAlign w:val="center"/>
+          </w:tcPr>
+          <w:p>
+            <w:pPr>
+              <w:jc w:val="left"/>
+            </w:pPr>
+            <w:r>
+              <w:rPr>
+                <w:b w:val="false"/>
+                <w:bCs w:val="false"/>
+                <w:sz w:val="19"/>
+                <w:szCs w:val="19"/>
+              </w:rPr>
+              <w:t xml:space="preserve">Junoh Lee</w:t>
+            </w:r>
+          </w:p>
+        </w:tc>
+        <w:tc>
+          <w:tcPr>
+            <w:tcW w:type="dxa" w:w="1684"/>
+            <w:tcBorders>
+              <w:top w:val="single" w:color="000000" w:sz="4"/>
+              <w:left w:val="single" w:color="000000" w:sz="4"/>
+              <w:bottom w:val="single" w:color="000000" w:sz="4"/>
+              <w:right w:val="single" w:color="000000" w:sz="4"/>
+            </w:tcBorders>
+            <w:tcMar>
+              <w:top w:type="dxa" w:w="90"/>
+              <w:left w:type="dxa" w:w="110"/>
+              <w:bottom w:type="dxa" w:w="90"/>
+              <w:right w:type="dxa" w:w="110"/>
+            </w:tcMar>
+            <w:vAlign w:val="center"/>
+          </w:tcPr>
+          <w:p>
+            <w:pPr>
+              <w:jc w:val="left"/>
+            </w:pPr>
+            <w:r>
+              <w:rPr>
+                <w:b w:val="false"/>
+                <w:bCs w:val="false"/>
+                <w:sz w:val="19"/>
+                <w:szCs w:val="19"/>
+              </w:rPr>
+              <w:t xml:space="preserve">2026-09-17</w:t>
+            </w:r>
+          </w:p>
+        </w:tc>
+        <w:tc>
+          <w:tcPr>
+            <w:tcW w:type="dxa" w:w="3931"/>
+            <w:tcBorders>
+              <w:top w:val="single" w:color="000000" w:sz="4"/>
+              <w:left w:val="single" w:color="000000" w:sz="4"/>
+              <w:bottom w:val="single" w:color="000000" w:sz="4"/>
+              <w:right w:val="single" w:color="000000" w:sz="4"/>
+            </w:tcBorders>
+            <w:tcMar>
+              <w:top w:type="dxa" w:w="90"/>
+              <w:left w:type="dxa" w:w="110"/>
+              <w:bottom w:type="dxa" w:w="90"/>
+              <w:right w:type="dxa" w:w="110"/>
+            </w:tcMar>
+            <w:vAlign w:val="center"/>
+          </w:tcPr>
+          <w:p>
+            <w:pPr>
+              <w:jc w:val="left"/>
+            </w:pPr>
+            <w:r>
+              <w:rPr>
+                <w:b w:val="false"/>
+                <w:bCs w:val="false"/>
+                <w:sz w:val="19"/>
+                <w:szCs w:val="19"/>
+              </w:rPr>
+              <w:t xml:space="preserve">Removed premature pythonocc-core naming (our own placeholder, not confirmed) from diagrams and module table; CAD kernel now shown as OCCT-based, TBD between FreeCAD-python API and cadquery</w:t>
+            </w:r>
+          </w:p>
+        </w:tc>
+        <w:tc>
+          <w:tcPr>
+            <w:tcW w:type="dxa" w:w="1684"/>
+            <w:tcBorders>
+              <w:top w:val="single" w:color="000000" w:sz="4"/>
+              <w:left w:val="single" w:color="000000" w:sz="4"/>
+              <w:bottom w:val="single" w:color="000000" w:sz="4"/>
+              <w:right w:val="single" w:color="000000" w:sz="4"/>
+            </w:tcBorders>
+            <w:tcMar>
+              <w:top w:type="dxa" w:w="90"/>
+              <w:left w:type="dxa" w:w="110"/>
+              <w:bottom w:type="dxa" w:w="90"/>
+              <w:right w:type="dxa" w:w="110"/>
+            </w:tcMar>
+            <w:vAlign w:val="center"/>
+          </w:tcPr>
+          <w:p>
+            <w:pPr>
+              <w:jc w:val="left"/>
+            </w:pPr>
+            <w:r>
+              <w:rPr>
+                <w:b w:val="false"/>
+                <w:bCs w:val="false"/>
+                <w:sz w:val="19"/>
+                <w:szCs w:val="19"/>
+              </w:rPr>
+              <w:t xml:space="preserve">1.1</w:t>
             </w:r>
           </w:p>
         </w:tc>
@@ -402,6 +532,18 @@
           <w:szCs w:val="21"/>
         </w:rPr>
         <w:t xml:space="preserve">The system consists of a core runtime pipeline (M1-M8) that processes one CAD model at a time, and a separate offline training pipeline that produces the trained feature-recognition model used by M3. The tool only proposes a defeatured result - every result is reviewed and approved by an engineer (M7) before being finalized, per the design principle that this is a decision-support tool, not a fully autonomous replacement for engineer judgment.</w:t>
+      </w:r>
+    </w:p>
+    <w:p>
+      <w:pPr>
+        <w:spacing w:after="140"/>
+      </w:pPr>
+      <w:r>
+        <w:rPr>
+          <w:sz w:val="21"/>
+          <w:szCs w:val="21"/>
+        </w:rPr>
+        <w:t xml:space="preserve">Note: the exact CAD toolchain (FreeCAD-python API vs. cadquery) and the feature recognition model are still open decisions. They are shown as labeled placeholders below rather than fixed choices, since a system architecture describes module boundaries and interfaces, not final algorithm/library selection - that level of detail belongs in the LLD once confirmed with the mentor.</w:t>
       </w:r>
     </w:p>
     <w:p>
@@ -569,10 +711,10 @@
             </w:tcBorders>
             <w:shd w:fill="D9D9D9" w:val="clear"/>
             <w:tcMar>
-              <w:top w:type="dxa" w:w="80"/>
-              <w:left w:type="dxa" w:w="100"/>
-              <w:bottom w:type="dxa" w:w="80"/>
-              <w:right w:type="dxa" w:w="100"/>
+              <w:top w:type="dxa" w:w="90"/>
+              <w:left w:type="dxa" w:w="110"/>
+              <w:bottom w:type="dxa" w:w="90"/>
+              <w:right w:type="dxa" w:w="110"/>
             </w:tcMar>
             <w:vAlign w:val="center"/>
           </w:tcPr>
@@ -602,10 +744,10 @@
             </w:tcBorders>
             <w:shd w:fill="D9D9D9" w:val="clear"/>
             <w:tcMar>
-              <w:top w:type="dxa" w:w="80"/>
-              <w:left w:type="dxa" w:w="100"/>
-              <w:bottom w:type="dxa" w:w="80"/>
-              <w:right w:type="dxa" w:w="100"/>
+              <w:top w:type="dxa" w:w="90"/>
+              <w:left w:type="dxa" w:w="110"/>
+              <w:bottom w:type="dxa" w:w="90"/>
+              <w:right w:type="dxa" w:w="110"/>
             </w:tcMar>
             <w:vAlign w:val="center"/>
           </w:tcPr>
@@ -635,10 +777,10 @@
             </w:tcBorders>
             <w:shd w:fill="D9D9D9" w:val="clear"/>
             <w:tcMar>
-              <w:top w:type="dxa" w:w="80"/>
-              <w:left w:type="dxa" w:w="100"/>
-              <w:bottom w:type="dxa" w:w="80"/>
-              <w:right w:type="dxa" w:w="100"/>
+              <w:top w:type="dxa" w:w="90"/>
+              <w:left w:type="dxa" w:w="110"/>
+              <w:bottom w:type="dxa" w:w="90"/>
+              <w:right w:type="dxa" w:w="110"/>
             </w:tcMar>
             <w:vAlign w:val="center"/>
           </w:tcPr>
@@ -669,10 +811,10 @@
               <w:right w:val="single" w:color="000000" w:sz="4"/>
             </w:tcBorders>
             <w:tcMar>
-              <w:top w:type="dxa" w:w="80"/>
-              <w:left w:type="dxa" w:w="100"/>
-              <w:bottom w:type="dxa" w:w="80"/>
-              <w:right w:type="dxa" w:w="100"/>
+              <w:top w:type="dxa" w:w="90"/>
+              <w:left w:type="dxa" w:w="110"/>
+              <w:bottom w:type="dxa" w:w="90"/>
+              <w:right w:type="dxa" w:w="110"/>
             </w:tcMar>
             <w:vAlign w:val="center"/>
           </w:tcPr>
@@ -701,10 +843,10 @@
               <w:right w:val="single" w:color="000000" w:sz="4"/>
             </w:tcBorders>
             <w:tcMar>
-              <w:top w:type="dxa" w:w="80"/>
-              <w:left w:type="dxa" w:w="100"/>
-              <w:bottom w:type="dxa" w:w="80"/>
-              <w:right w:type="dxa" w:w="100"/>
+              <w:top w:type="dxa" w:w="90"/>
+              <w:left w:type="dxa" w:w="110"/>
+              <w:bottom w:type="dxa" w:w="90"/>
+              <w:right w:type="dxa" w:w="110"/>
             </w:tcMar>
             <w:vAlign w:val="center"/>
           </w:tcPr>
@@ -733,25 +875,25 @@
               <w:right w:val="single" w:color="000000" w:sz="4"/>
             </w:tcBorders>
             <w:tcMar>
-              <w:top w:type="dxa" w:w="80"/>
-              <w:left w:type="dxa" w:w="100"/>
-              <w:bottom w:type="dxa" w:w="80"/>
-              <w:right w:type="dxa" w:w="100"/>
-            </w:tcMar>
-            <w:vAlign w:val="center"/>
-          </w:tcPr>
-          <w:p>
-            <w:pPr>
-              <w:jc w:val="left"/>
-            </w:pPr>
-            <w:r>
-              <w:rPr>
-                <w:b w:val="false"/>
-                <w:bCs w:val="false"/>
-                <w:sz w:val="19"/>
-                <w:szCs w:val="19"/>
-              </w:rPr>
-              <w:t xml:space="preserve">pythonocc-core (OCCT)</w:t>
+              <w:top w:type="dxa" w:w="90"/>
+              <w:left w:type="dxa" w:w="110"/>
+              <w:bottom w:type="dxa" w:w="90"/>
+              <w:right w:type="dxa" w:w="110"/>
+            </w:tcMar>
+            <w:vAlign w:val="center"/>
+          </w:tcPr>
+          <w:p>
+            <w:pPr>
+              <w:jc w:val="left"/>
+            </w:pPr>
+            <w:r>
+              <w:rPr>
+                <w:b w:val="false"/>
+                <w:bCs w:val="false"/>
+                <w:sz w:val="19"/>
+                <w:szCs w:val="19"/>
+              </w:rPr>
+              <w:t xml:space="preserve">OCCT-based (TBD: FreeCAD-python API / cadquery)</w:t>
             </w:r>
           </w:p>
         </w:tc>
@@ -767,10 +909,10 @@
               <w:right w:val="single" w:color="000000" w:sz="4"/>
             </w:tcBorders>
             <w:tcMar>
-              <w:top w:type="dxa" w:w="80"/>
-              <w:left w:type="dxa" w:w="100"/>
-              <w:bottom w:type="dxa" w:w="80"/>
-              <w:right w:type="dxa" w:w="100"/>
+              <w:top w:type="dxa" w:w="90"/>
+              <w:left w:type="dxa" w:w="110"/>
+              <w:bottom w:type="dxa" w:w="90"/>
+              <w:right w:type="dxa" w:w="110"/>
             </w:tcMar>
             <w:vAlign w:val="center"/>
           </w:tcPr>
@@ -799,10 +941,10 @@
               <w:right w:val="single" w:color="000000" w:sz="4"/>
             </w:tcBorders>
             <w:tcMar>
-              <w:top w:type="dxa" w:w="80"/>
-              <w:left w:type="dxa" w:w="100"/>
-              <w:bottom w:type="dxa" w:w="80"/>
-              <w:right w:type="dxa" w:w="100"/>
+              <w:top w:type="dxa" w:w="90"/>
+              <w:left w:type="dxa" w:w="110"/>
+              <w:bottom w:type="dxa" w:w="90"/>
+              <w:right w:type="dxa" w:w="110"/>
             </w:tcMar>
             <w:vAlign w:val="center"/>
           </w:tcPr>
@@ -831,10 +973,10 @@
               <w:right w:val="single" w:color="000000" w:sz="4"/>
             </w:tcBorders>
             <w:tcMar>
-              <w:top w:type="dxa" w:w="80"/>
-              <w:left w:type="dxa" w:w="100"/>
-              <w:bottom w:type="dxa" w:w="80"/>
-              <w:right w:type="dxa" w:w="100"/>
+              <w:top w:type="dxa" w:w="90"/>
+              <w:left w:type="dxa" w:w="110"/>
+              <w:bottom w:type="dxa" w:w="90"/>
+              <w:right w:type="dxa" w:w="110"/>
             </w:tcMar>
             <w:vAlign w:val="center"/>
           </w:tcPr>
@@ -865,10 +1007,10 @@
               <w:right w:val="single" w:color="000000" w:sz="4"/>
             </w:tcBorders>
             <w:tcMar>
-              <w:top w:type="dxa" w:w="80"/>
-              <w:left w:type="dxa" w:w="100"/>
-              <w:bottom w:type="dxa" w:w="80"/>
-              <w:right w:type="dxa" w:w="100"/>
+              <w:top w:type="dxa" w:w="90"/>
+              <w:left w:type="dxa" w:w="110"/>
+              <w:bottom w:type="dxa" w:w="90"/>
+              <w:right w:type="dxa" w:w="110"/>
             </w:tcMar>
             <w:vAlign w:val="center"/>
           </w:tcPr>
@@ -897,10 +1039,10 @@
               <w:right w:val="single" w:color="000000" w:sz="4"/>
             </w:tcBorders>
             <w:tcMar>
-              <w:top w:type="dxa" w:w="80"/>
-              <w:left w:type="dxa" w:w="100"/>
-              <w:bottom w:type="dxa" w:w="80"/>
-              <w:right w:type="dxa" w:w="100"/>
+              <w:top w:type="dxa" w:w="90"/>
+              <w:left w:type="dxa" w:w="110"/>
+              <w:bottom w:type="dxa" w:w="90"/>
+              <w:right w:type="dxa" w:w="110"/>
             </w:tcMar>
             <w:vAlign w:val="center"/>
           </w:tcPr>
@@ -929,10 +1071,10 @@
               <w:right w:val="single" w:color="000000" w:sz="4"/>
             </w:tcBorders>
             <w:tcMar>
-              <w:top w:type="dxa" w:w="80"/>
-              <w:left w:type="dxa" w:w="100"/>
-              <w:bottom w:type="dxa" w:w="80"/>
-              <w:right w:type="dxa" w:w="100"/>
+              <w:top w:type="dxa" w:w="90"/>
+              <w:left w:type="dxa" w:w="110"/>
+              <w:bottom w:type="dxa" w:w="90"/>
+              <w:right w:type="dxa" w:w="110"/>
             </w:tcMar>
             <w:vAlign w:val="center"/>
           </w:tcPr>
@@ -963,10 +1105,10 @@
               <w:right w:val="single" w:color="000000" w:sz="4"/>
             </w:tcBorders>
             <w:tcMar>
-              <w:top w:type="dxa" w:w="80"/>
-              <w:left w:type="dxa" w:w="100"/>
-              <w:bottom w:type="dxa" w:w="80"/>
-              <w:right w:type="dxa" w:w="100"/>
+              <w:top w:type="dxa" w:w="90"/>
+              <w:left w:type="dxa" w:w="110"/>
+              <w:bottom w:type="dxa" w:w="90"/>
+              <w:right w:type="dxa" w:w="110"/>
             </w:tcMar>
             <w:vAlign w:val="center"/>
           </w:tcPr>
@@ -995,10 +1137,10 @@
               <w:right w:val="single" w:color="000000" w:sz="4"/>
             </w:tcBorders>
             <w:tcMar>
-              <w:top w:type="dxa" w:w="80"/>
-              <w:left w:type="dxa" w:w="100"/>
-              <w:bottom w:type="dxa" w:w="80"/>
-              <w:right w:type="dxa" w:w="100"/>
+              <w:top w:type="dxa" w:w="90"/>
+              <w:left w:type="dxa" w:w="110"/>
+              <w:bottom w:type="dxa" w:w="90"/>
+              <w:right w:type="dxa" w:w="110"/>
             </w:tcMar>
             <w:vAlign w:val="center"/>
           </w:tcPr>
@@ -1027,10 +1169,10 @@
               <w:right w:val="single" w:color="000000" w:sz="4"/>
             </w:tcBorders>
             <w:tcMar>
-              <w:top w:type="dxa" w:w="80"/>
-              <w:left w:type="dxa" w:w="100"/>
-              <w:bottom w:type="dxa" w:w="80"/>
-              <w:right w:type="dxa" w:w="100"/>
+              <w:top w:type="dxa" w:w="90"/>
+              <w:left w:type="dxa" w:w="110"/>
+              <w:bottom w:type="dxa" w:w="90"/>
+              <w:right w:type="dxa" w:w="110"/>
             </w:tcMar>
             <w:vAlign w:val="center"/>
           </w:tcPr>
@@ -1061,10 +1203,10 @@
               <w:right w:val="single" w:color="000000" w:sz="4"/>
             </w:tcBorders>
             <w:tcMar>
-              <w:top w:type="dxa" w:w="80"/>
-              <w:left w:type="dxa" w:w="100"/>
-              <w:bottom w:type="dxa" w:w="80"/>
-              <w:right w:type="dxa" w:w="100"/>
+              <w:top w:type="dxa" w:w="90"/>
+              <w:left w:type="dxa" w:w="110"/>
+              <w:bottom w:type="dxa" w:w="90"/>
+              <w:right w:type="dxa" w:w="110"/>
             </w:tcMar>
             <w:vAlign w:val="center"/>
           </w:tcPr>
@@ -1093,10 +1235,10 @@
               <w:right w:val="single" w:color="000000" w:sz="4"/>
             </w:tcBorders>
             <w:tcMar>
-              <w:top w:type="dxa" w:w="80"/>
-              <w:left w:type="dxa" w:w="100"/>
-              <w:bottom w:type="dxa" w:w="80"/>
-              <w:right w:type="dxa" w:w="100"/>
+              <w:top w:type="dxa" w:w="90"/>
+              <w:left w:type="dxa" w:w="110"/>
+              <w:bottom w:type="dxa" w:w="90"/>
+              <w:right w:type="dxa" w:w="110"/>
             </w:tcMar>
             <w:vAlign w:val="center"/>
           </w:tcPr>
@@ -1125,25 +1267,25 @@
               <w:right w:val="single" w:color="000000" w:sz="4"/>
             </w:tcBorders>
             <w:tcMar>
-              <w:top w:type="dxa" w:w="80"/>
-              <w:left w:type="dxa" w:w="100"/>
-              <w:bottom w:type="dxa" w:w="80"/>
-              <w:right w:type="dxa" w:w="100"/>
-            </w:tcMar>
-            <w:vAlign w:val="center"/>
-          </w:tcPr>
-          <w:p>
-            <w:pPr>
-              <w:jc w:val="left"/>
-            </w:pPr>
-            <w:r>
-              <w:rPr>
-                <w:b w:val="false"/>
-                <w:bCs w:val="false"/>
-                <w:sz w:val="19"/>
-                <w:szCs w:val="19"/>
-              </w:rPr>
-              <w:t xml:space="preserve">pythonocc-core (BRepFilletAPI, ShapeUpgrade, etc.)</w:t>
+              <w:top w:type="dxa" w:w="90"/>
+              <w:left w:type="dxa" w:w="110"/>
+              <w:bottom w:type="dxa" w:w="90"/>
+              <w:right w:type="dxa" w:w="110"/>
+            </w:tcMar>
+            <w:vAlign w:val="center"/>
+          </w:tcPr>
+          <w:p>
+            <w:pPr>
+              <w:jc w:val="left"/>
+            </w:pPr>
+            <w:r>
+              <w:rPr>
+                <w:b w:val="false"/>
+                <w:bCs w:val="false"/>
+                <w:sz w:val="19"/>
+                <w:szCs w:val="19"/>
+              </w:rPr>
+              <w:t xml:space="preserve">OCCT-based (TBD: FreeCAD-python API / cadquery)</w:t>
             </w:r>
           </w:p>
         </w:tc>
@@ -1159,10 +1301,10 @@
               <w:right w:val="single" w:color="000000" w:sz="4"/>
             </w:tcBorders>
             <w:tcMar>
-              <w:top w:type="dxa" w:w="80"/>
-              <w:left w:type="dxa" w:w="100"/>
-              <w:bottom w:type="dxa" w:w="80"/>
-              <w:right w:type="dxa" w:w="100"/>
+              <w:top w:type="dxa" w:w="90"/>
+              <w:left w:type="dxa" w:w="110"/>
+              <w:bottom w:type="dxa" w:w="90"/>
+              <w:right w:type="dxa" w:w="110"/>
             </w:tcMar>
             <w:vAlign w:val="center"/>
           </w:tcPr>
@@ -1191,10 +1333,10 @@
               <w:right w:val="single" w:color="000000" w:sz="4"/>
             </w:tcBorders>
             <w:tcMar>
-              <w:top w:type="dxa" w:w="80"/>
-              <w:left w:type="dxa" w:w="100"/>
-              <w:bottom w:type="dxa" w:w="80"/>
-              <w:right w:type="dxa" w:w="100"/>
+              <w:top w:type="dxa" w:w="90"/>
+              <w:left w:type="dxa" w:w="110"/>
+              <w:bottom w:type="dxa" w:w="90"/>
+              <w:right w:type="dxa" w:w="110"/>
             </w:tcMar>
             <w:vAlign w:val="center"/>
           </w:tcPr>
@@ -1223,25 +1365,25 @@
               <w:right w:val="single" w:color="000000" w:sz="4"/>
             </w:tcBorders>
             <w:tcMar>
-              <w:top w:type="dxa" w:w="80"/>
-              <w:left w:type="dxa" w:w="100"/>
-              <w:bottom w:type="dxa" w:w="80"/>
-              <w:right w:type="dxa" w:w="100"/>
-            </w:tcMar>
-            <w:vAlign w:val="center"/>
-          </w:tcPr>
-          <w:p>
-            <w:pPr>
-              <w:jc w:val="left"/>
-            </w:pPr>
-            <w:r>
-              <w:rPr>
-                <w:b w:val="false"/>
-                <w:bCs w:val="false"/>
-                <w:sz w:val="19"/>
-                <w:szCs w:val="19"/>
-              </w:rPr>
-              <w:t xml:space="preserve">pythonocc-core + rendering</w:t>
+              <w:top w:type="dxa" w:w="90"/>
+              <w:left w:type="dxa" w:w="110"/>
+              <w:bottom w:type="dxa" w:w="90"/>
+              <w:right w:type="dxa" w:w="110"/>
+            </w:tcMar>
+            <w:vAlign w:val="center"/>
+          </w:tcPr>
+          <w:p>
+            <w:pPr>
+              <w:jc w:val="left"/>
+            </w:pPr>
+            <w:r>
+              <w:rPr>
+                <w:b w:val="false"/>
+                <w:bCs w:val="false"/>
+                <w:sz w:val="19"/>
+                <w:szCs w:val="19"/>
+              </w:rPr>
+              <w:t xml:space="preserve">Same OCCT toolchain + rendering</w:t>
             </w:r>
           </w:p>
         </w:tc>
@@ -1257,10 +1399,10 @@
               <w:right w:val="single" w:color="000000" w:sz="4"/>
             </w:tcBorders>
             <w:tcMar>
-              <w:top w:type="dxa" w:w="80"/>
-              <w:left w:type="dxa" w:w="100"/>
-              <w:bottom w:type="dxa" w:w="80"/>
-              <w:right w:type="dxa" w:w="100"/>
+              <w:top w:type="dxa" w:w="90"/>
+              <w:left w:type="dxa" w:w="110"/>
+              <w:bottom w:type="dxa" w:w="90"/>
+              <w:right w:type="dxa" w:w="110"/>
             </w:tcMar>
             <w:vAlign w:val="center"/>
           </w:tcPr>
@@ -1289,10 +1431,10 @@
               <w:right w:val="single" w:color="000000" w:sz="4"/>
             </w:tcBorders>
             <w:tcMar>
-              <w:top w:type="dxa" w:w="80"/>
-              <w:left w:type="dxa" w:w="100"/>
-              <w:bottom w:type="dxa" w:w="80"/>
-              <w:right w:type="dxa" w:w="100"/>
+              <w:top w:type="dxa" w:w="90"/>
+              <w:left w:type="dxa" w:w="110"/>
+              <w:bottom w:type="dxa" w:w="90"/>
+              <w:right w:type="dxa" w:w="110"/>
             </w:tcMar>
             <w:vAlign w:val="center"/>
           </w:tcPr>
@@ -1321,10 +1463,10 @@
               <w:right w:val="single" w:color="000000" w:sz="4"/>
             </w:tcBorders>
             <w:tcMar>
-              <w:top w:type="dxa" w:w="80"/>
-              <w:left w:type="dxa" w:w="100"/>
-              <w:bottom w:type="dxa" w:w="80"/>
-              <w:right w:type="dxa" w:w="100"/>
+              <w:top w:type="dxa" w:w="90"/>
+              <w:left w:type="dxa" w:w="110"/>
+              <w:bottom w:type="dxa" w:w="90"/>
+              <w:right w:type="dxa" w:w="110"/>
             </w:tcMar>
             <w:vAlign w:val="center"/>
           </w:tcPr>
@@ -1355,10 +1497,10 @@
               <w:right w:val="single" w:color="000000" w:sz="4"/>
             </w:tcBorders>
             <w:tcMar>
-              <w:top w:type="dxa" w:w="80"/>
-              <w:left w:type="dxa" w:w="100"/>
-              <w:bottom w:type="dxa" w:w="80"/>
-              <w:right w:type="dxa" w:w="100"/>
+              <w:top w:type="dxa" w:w="90"/>
+              <w:left w:type="dxa" w:w="110"/>
+              <w:bottom w:type="dxa" w:w="90"/>
+              <w:right w:type="dxa" w:w="110"/>
             </w:tcMar>
             <w:vAlign w:val="center"/>
           </w:tcPr>
@@ -1387,10 +1529,10 @@
               <w:right w:val="single" w:color="000000" w:sz="4"/>
             </w:tcBorders>
             <w:tcMar>
-              <w:top w:type="dxa" w:w="80"/>
-              <w:left w:type="dxa" w:w="100"/>
-              <w:bottom w:type="dxa" w:w="80"/>
-              <w:right w:type="dxa" w:w="100"/>
+              <w:top w:type="dxa" w:w="90"/>
+              <w:left w:type="dxa" w:w="110"/>
+              <w:bottom w:type="dxa" w:w="90"/>
+              <w:right w:type="dxa" w:w="110"/>
             </w:tcMar>
             <w:vAlign w:val="center"/>
           </w:tcPr>
@@ -1419,10 +1561,10 @@
               <w:right w:val="single" w:color="000000" w:sz="4"/>
             </w:tcBorders>
             <w:tcMar>
-              <w:top w:type="dxa" w:w="80"/>
-              <w:left w:type="dxa" w:w="100"/>
-              <w:bottom w:type="dxa" w:w="80"/>
-              <w:right w:type="dxa" w:w="100"/>
+              <w:top w:type="dxa" w:w="90"/>
+              <w:left w:type="dxa" w:w="110"/>
+              <w:bottom w:type="dxa" w:w="90"/>
+              <w:right w:type="dxa" w:w="110"/>
             </w:tcMar>
             <w:vAlign w:val="center"/>
           </w:tcPr>
@@ -1483,10 +1625,10 @@
             </w:tcBorders>
             <w:shd w:fill="D9D9D9" w:val="clear"/>
             <w:tcMar>
-              <w:top w:type="dxa" w:w="80"/>
-              <w:left w:type="dxa" w:w="100"/>
-              <w:bottom w:type="dxa" w:w="80"/>
-              <w:right w:type="dxa" w:w="100"/>
+              <w:top w:type="dxa" w:w="90"/>
+              <w:left w:type="dxa" w:w="110"/>
+              <w:bottom w:type="dxa" w:w="90"/>
+              <w:right w:type="dxa" w:w="110"/>
             </w:tcMar>
             <w:vAlign w:val="center"/>
           </w:tcPr>
@@ -1516,10 +1658,10 @@
             </w:tcBorders>
             <w:shd w:fill="D9D9D9" w:val="clear"/>
             <w:tcMar>
-              <w:top w:type="dxa" w:w="80"/>
-              <w:left w:type="dxa" w:w="100"/>
-              <w:bottom w:type="dxa" w:w="80"/>
-              <w:right w:type="dxa" w:w="100"/>
+              <w:top w:type="dxa" w:w="90"/>
+              <w:left w:type="dxa" w:w="110"/>
+              <w:bottom w:type="dxa" w:w="90"/>
+              <w:right w:type="dxa" w:w="110"/>
             </w:tcMar>
             <w:vAlign w:val="center"/>
           </w:tcPr>
@@ -1550,10 +1692,10 @@
               <w:right w:val="single" w:color="000000" w:sz="4"/>
             </w:tcBorders>
             <w:tcMar>
-              <w:top w:type="dxa" w:w="80"/>
-              <w:left w:type="dxa" w:w="100"/>
-              <w:bottom w:type="dxa" w:w="80"/>
-              <w:right w:type="dxa" w:w="100"/>
+              <w:top w:type="dxa" w:w="90"/>
+              <w:left w:type="dxa" w:w="110"/>
+              <w:bottom w:type="dxa" w:w="90"/>
+              <w:right w:type="dxa" w:w="110"/>
             </w:tcMar>
             <w:vAlign w:val="center"/>
           </w:tcPr>
@@ -1582,25 +1724,25 @@
               <w:right w:val="single" w:color="000000" w:sz="4"/>
             </w:tcBorders>
             <w:tcMar>
-              <w:top w:type="dxa" w:w="80"/>
-              <w:left w:type="dxa" w:w="100"/>
-              <w:bottom w:type="dxa" w:w="80"/>
-              <w:right w:type="dxa" w:w="100"/>
-            </w:tcMar>
-            <w:vAlign w:val="center"/>
-          </w:tcPr>
-          <w:p>
-            <w:pPr>
-              <w:jc w:val="left"/>
-            </w:pPr>
-            <w:r>
-              <w:rPr>
-                <w:b w:val="false"/>
-                <w:bCs w:val="false"/>
-                <w:sz w:val="19"/>
-                <w:szCs w:val="19"/>
-              </w:rPr>
-              <w:t xml:space="preserve">In-memory B-rep model (OCCT TopoDS_Shape)</w:t>
+              <w:top w:type="dxa" w:w="90"/>
+              <w:left w:type="dxa" w:w="110"/>
+              <w:bottom w:type="dxa" w:w="90"/>
+              <w:right w:type="dxa" w:w="110"/>
+            </w:tcMar>
+            <w:vAlign w:val="center"/>
+          </w:tcPr>
+          <w:p>
+            <w:pPr>
+              <w:jc w:val="left"/>
+            </w:pPr>
+            <w:r>
+              <w:rPr>
+                <w:b w:val="false"/>
+                <w:bCs w:val="false"/>
+                <w:sz w:val="19"/>
+                <w:szCs w:val="19"/>
+              </w:rPr>
+              <w:t xml:space="preserve">In-memory B-rep model (OCCT shape representation)</w:t>
             </w:r>
           </w:p>
         </w:tc>
@@ -1616,10 +1758,10 @@
               <w:right w:val="single" w:color="000000" w:sz="4"/>
             </w:tcBorders>
             <w:tcMar>
-              <w:top w:type="dxa" w:w="80"/>
-              <w:left w:type="dxa" w:w="100"/>
-              <w:bottom w:type="dxa" w:w="80"/>
-              <w:right w:type="dxa" w:w="100"/>
+              <w:top w:type="dxa" w:w="90"/>
+              <w:left w:type="dxa" w:w="110"/>
+              <w:bottom w:type="dxa" w:w="90"/>
+              <w:right w:type="dxa" w:w="110"/>
             </w:tcMar>
             <w:vAlign w:val="center"/>
           </w:tcPr>
@@ -1648,10 +1790,10 @@
               <w:right w:val="single" w:color="000000" w:sz="4"/>
             </w:tcBorders>
             <w:tcMar>
-              <w:top w:type="dxa" w:w="80"/>
-              <w:left w:type="dxa" w:w="100"/>
-              <w:bottom w:type="dxa" w:w="80"/>
-              <w:right w:type="dxa" w:w="100"/>
+              <w:top w:type="dxa" w:w="90"/>
+              <w:left w:type="dxa" w:w="110"/>
+              <w:bottom w:type="dxa" w:w="90"/>
+              <w:right w:type="dxa" w:w="110"/>
             </w:tcMar>
             <w:vAlign w:val="center"/>
           </w:tcPr>
@@ -1682,10 +1824,10 @@
               <w:right w:val="single" w:color="000000" w:sz="4"/>
             </w:tcBorders>
             <w:tcMar>
-              <w:top w:type="dxa" w:w="80"/>
-              <w:left w:type="dxa" w:w="100"/>
-              <w:bottom w:type="dxa" w:w="80"/>
-              <w:right w:type="dxa" w:w="100"/>
+              <w:top w:type="dxa" w:w="90"/>
+              <w:left w:type="dxa" w:w="110"/>
+              <w:bottom w:type="dxa" w:w="90"/>
+              <w:right w:type="dxa" w:w="110"/>
             </w:tcMar>
             <w:vAlign w:val="center"/>
           </w:tcPr>
@@ -1714,10 +1856,10 @@
               <w:right w:val="single" w:color="000000" w:sz="4"/>
             </w:tcBorders>
             <w:tcMar>
-              <w:top w:type="dxa" w:w="80"/>
-              <w:left w:type="dxa" w:w="100"/>
-              <w:bottom w:type="dxa" w:w="80"/>
-              <w:right w:type="dxa" w:w="100"/>
+              <w:top w:type="dxa" w:w="90"/>
+              <w:left w:type="dxa" w:w="110"/>
+              <w:bottom w:type="dxa" w:w="90"/>
+              <w:right w:type="dxa" w:w="110"/>
             </w:tcMar>
             <w:vAlign w:val="center"/>
           </w:tcPr>
@@ -1748,10 +1890,10 @@
               <w:right w:val="single" w:color="000000" w:sz="4"/>
             </w:tcBorders>
             <w:tcMar>
-              <w:top w:type="dxa" w:w="80"/>
-              <w:left w:type="dxa" w:w="100"/>
-              <w:bottom w:type="dxa" w:w="80"/>
-              <w:right w:type="dxa" w:w="100"/>
+              <w:top w:type="dxa" w:w="90"/>
+              <w:left w:type="dxa" w:w="110"/>
+              <w:bottom w:type="dxa" w:w="90"/>
+              <w:right w:type="dxa" w:w="110"/>
             </w:tcMar>
             <w:vAlign w:val="center"/>
           </w:tcPr>
@@ -1780,10 +1922,10 @@
               <w:right w:val="single" w:color="000000" w:sz="4"/>
             </w:tcBorders>
             <w:tcMar>
-              <w:top w:type="dxa" w:w="80"/>
-              <w:left w:type="dxa" w:w="100"/>
-              <w:bottom w:type="dxa" w:w="80"/>
-              <w:right w:type="dxa" w:w="100"/>
+              <w:top w:type="dxa" w:w="90"/>
+              <w:left w:type="dxa" w:w="110"/>
+              <w:bottom w:type="dxa" w:w="90"/>
+              <w:right w:type="dxa" w:w="110"/>
             </w:tcMar>
             <w:vAlign w:val="center"/>
           </w:tcPr>
@@ -1814,10 +1956,10 @@
               <w:right w:val="single" w:color="000000" w:sz="4"/>
             </w:tcBorders>
             <w:tcMar>
-              <w:top w:type="dxa" w:w="80"/>
-              <w:left w:type="dxa" w:w="100"/>
-              <w:bottom w:type="dxa" w:w="80"/>
-              <w:right w:type="dxa" w:w="100"/>
+              <w:top w:type="dxa" w:w="90"/>
+              <w:left w:type="dxa" w:w="110"/>
+              <w:bottom w:type="dxa" w:w="90"/>
+              <w:right w:type="dxa" w:w="110"/>
             </w:tcMar>
             <w:vAlign w:val="center"/>
           </w:tcPr>
@@ -1846,10 +1988,10 @@
               <w:right w:val="single" w:color="000000" w:sz="4"/>
             </w:tcBorders>
             <w:tcMar>
-              <w:top w:type="dxa" w:w="80"/>
-              <w:left w:type="dxa" w:w="100"/>
-              <w:bottom w:type="dxa" w:w="80"/>
-              <w:right w:type="dxa" w:w="100"/>
+              <w:top w:type="dxa" w:w="90"/>
+              <w:left w:type="dxa" w:w="110"/>
+              <w:bottom w:type="dxa" w:w="90"/>
+              <w:right w:type="dxa" w:w="110"/>
             </w:tcMar>
             <w:vAlign w:val="center"/>
           </w:tcPr>
@@ -1880,10 +2022,10 @@
               <w:right w:val="single" w:color="000000" w:sz="4"/>
             </w:tcBorders>
             <w:tcMar>
-              <w:top w:type="dxa" w:w="80"/>
-              <w:left w:type="dxa" w:w="100"/>
-              <w:bottom w:type="dxa" w:w="80"/>
-              <w:right w:type="dxa" w:w="100"/>
+              <w:top w:type="dxa" w:w="90"/>
+              <w:left w:type="dxa" w:w="110"/>
+              <w:bottom w:type="dxa" w:w="90"/>
+              <w:right w:type="dxa" w:w="110"/>
             </w:tcMar>
             <w:vAlign w:val="center"/>
           </w:tcPr>
@@ -1912,10 +2054,10 @@
               <w:right w:val="single" w:color="000000" w:sz="4"/>
             </w:tcBorders>
             <w:tcMar>
-              <w:top w:type="dxa" w:w="80"/>
-              <w:left w:type="dxa" w:w="100"/>
-              <w:bottom w:type="dxa" w:w="80"/>
-              <w:right w:type="dxa" w:w="100"/>
+              <w:top w:type="dxa" w:w="90"/>
+              <w:left w:type="dxa" w:w="110"/>
+              <w:bottom w:type="dxa" w:w="90"/>
+              <w:right w:type="dxa" w:w="110"/>
             </w:tcMar>
             <w:vAlign w:val="center"/>
           </w:tcPr>
@@ -1946,10 +2088,10 @@
               <w:right w:val="single" w:color="000000" w:sz="4"/>
             </w:tcBorders>
             <w:tcMar>
-              <w:top w:type="dxa" w:w="80"/>
-              <w:left w:type="dxa" w:w="100"/>
-              <w:bottom w:type="dxa" w:w="80"/>
-              <w:right w:type="dxa" w:w="100"/>
+              <w:top w:type="dxa" w:w="90"/>
+              <w:left w:type="dxa" w:w="110"/>
+              <w:bottom w:type="dxa" w:w="90"/>
+              <w:right w:type="dxa" w:w="110"/>
             </w:tcMar>
             <w:vAlign w:val="center"/>
           </w:tcPr>
@@ -1978,10 +2120,10 @@
               <w:right w:val="single" w:color="000000" w:sz="4"/>
             </w:tcBorders>
             <w:tcMar>
-              <w:top w:type="dxa" w:w="80"/>
-              <w:left w:type="dxa" w:w="100"/>
-              <w:bottom w:type="dxa" w:w="80"/>
-              <w:right w:type="dxa" w:w="100"/>
+              <w:top w:type="dxa" w:w="90"/>
+              <w:left w:type="dxa" w:w="110"/>
+              <w:bottom w:type="dxa" w:w="90"/>
+              <w:right w:type="dxa" w:w="110"/>
             </w:tcMar>
             <w:vAlign w:val="center"/>
           </w:tcPr>
@@ -2012,10 +2154,10 @@
               <w:right w:val="single" w:color="000000" w:sz="4"/>
             </w:tcBorders>
             <w:tcMar>
-              <w:top w:type="dxa" w:w="80"/>
-              <w:left w:type="dxa" w:w="100"/>
-              <w:bottom w:type="dxa" w:w="80"/>
-              <w:right w:type="dxa" w:w="100"/>
+              <w:top w:type="dxa" w:w="90"/>
+              <w:left w:type="dxa" w:w="110"/>
+              <w:bottom w:type="dxa" w:w="90"/>
+              <w:right w:type="dxa" w:w="110"/>
             </w:tcMar>
             <w:vAlign w:val="center"/>
           </w:tcPr>
@@ -2044,10 +2186,10 @@
               <w:right w:val="single" w:color="000000" w:sz="4"/>
             </w:tcBorders>
             <w:tcMar>
-              <w:top w:type="dxa" w:w="80"/>
-              <w:left w:type="dxa" w:w="100"/>
-              <w:bottom w:type="dxa" w:w="80"/>
-              <w:right w:type="dxa" w:w="100"/>
+              <w:top w:type="dxa" w:w="90"/>
+              <w:left w:type="dxa" w:w="110"/>
+              <w:bottom w:type="dxa" w:w="90"/>
+              <w:right w:type="dxa" w:w="110"/>
             </w:tcMar>
             <w:vAlign w:val="center"/>
           </w:tcPr>
@@ -2078,10 +2220,10 @@
               <w:right w:val="single" w:color="000000" w:sz="4"/>
             </w:tcBorders>
             <w:tcMar>
-              <w:top w:type="dxa" w:w="80"/>
-              <w:left w:type="dxa" w:w="100"/>
-              <w:bottom w:type="dxa" w:w="80"/>
-              <w:right w:type="dxa" w:w="100"/>
+              <w:top w:type="dxa" w:w="90"/>
+              <w:left w:type="dxa" w:w="110"/>
+              <w:bottom w:type="dxa" w:w="90"/>
+              <w:right w:type="dxa" w:w="110"/>
             </w:tcMar>
             <w:vAlign w:val="center"/>
           </w:tcPr>
@@ -2110,10 +2252,10 @@
               <w:right w:val="single" w:color="000000" w:sz="4"/>
             </w:tcBorders>
             <w:tcMar>
-              <w:top w:type="dxa" w:w="80"/>
-              <w:left w:type="dxa" w:w="100"/>
-              <w:bottom w:type="dxa" w:w="80"/>
-              <w:right w:type="dxa" w:w="100"/>
+              <w:top w:type="dxa" w:w="90"/>
+              <w:left w:type="dxa" w:w="110"/>
+              <w:bottom w:type="dxa" w:w="90"/>
+              <w:right w:type="dxa" w:w="110"/>
             </w:tcMar>
             <w:vAlign w:val="center"/>
           </w:tcPr>
@@ -2144,10 +2286,10 @@
               <w:right w:val="single" w:color="000000" w:sz="4"/>
             </w:tcBorders>
             <w:tcMar>
-              <w:top w:type="dxa" w:w="80"/>
-              <w:left w:type="dxa" w:w="100"/>
-              <w:bottom w:type="dxa" w:w="80"/>
-              <w:right w:type="dxa" w:w="100"/>
+              <w:top w:type="dxa" w:w="90"/>
+              <w:left w:type="dxa" w:w="110"/>
+              <w:bottom w:type="dxa" w:w="90"/>
+              <w:right w:type="dxa" w:w="110"/>
             </w:tcMar>
             <w:vAlign w:val="center"/>
           </w:tcPr>
@@ -2176,10 +2318,10 @@
               <w:right w:val="single" w:color="000000" w:sz="4"/>
             </w:tcBorders>
             <w:tcMar>
-              <w:top w:type="dxa" w:w="80"/>
-              <w:left w:type="dxa" w:w="100"/>
-              <w:bottom w:type="dxa" w:w="80"/>
-              <w:right w:type="dxa" w:w="100"/>
+              <w:top w:type="dxa" w:w="90"/>
+              <w:left w:type="dxa" w:w="110"/>
+              <w:bottom w:type="dxa" w:w="90"/>
+              <w:right w:type="dxa" w:w="110"/>
             </w:tcMar>
             <w:vAlign w:val="center"/>
           </w:tcPr>
@@ -2241,10 +2383,10 @@
             </w:tcBorders>
             <w:shd w:fill="D9D9D9" w:val="clear"/>
             <w:tcMar>
-              <w:top w:type="dxa" w:w="80"/>
-              <w:left w:type="dxa" w:w="100"/>
-              <w:bottom w:type="dxa" w:w="80"/>
-              <w:right w:type="dxa" w:w="100"/>
+              <w:top w:type="dxa" w:w="90"/>
+              <w:left w:type="dxa" w:w="110"/>
+              <w:bottom w:type="dxa" w:w="90"/>
+              <w:right w:type="dxa" w:w="110"/>
             </w:tcMar>
             <w:vAlign w:val="center"/>
           </w:tcPr>
@@ -2274,10 +2416,10 @@
             </w:tcBorders>
             <w:shd w:fill="D9D9D9" w:val="clear"/>
             <w:tcMar>
-              <w:top w:type="dxa" w:w="80"/>
-              <w:left w:type="dxa" w:w="100"/>
-              <w:bottom w:type="dxa" w:w="80"/>
-              <w:right w:type="dxa" w:w="100"/>
+              <w:top w:type="dxa" w:w="90"/>
+              <w:left w:type="dxa" w:w="110"/>
+              <w:bottom w:type="dxa" w:w="90"/>
+              <w:right w:type="dxa" w:w="110"/>
             </w:tcMar>
             <w:vAlign w:val="center"/>
           </w:tcPr>
@@ -2307,10 +2449,10 @@
             </w:tcBorders>
             <w:shd w:fill="D9D9D9" w:val="clear"/>
             <w:tcMar>
-              <w:top w:type="dxa" w:w="80"/>
-              <w:left w:type="dxa" w:w="100"/>
-              <w:bottom w:type="dxa" w:w="80"/>
-              <w:right w:type="dxa" w:w="100"/>
+              <w:top w:type="dxa" w:w="90"/>
+              <w:left w:type="dxa" w:w="110"/>
+              <w:bottom w:type="dxa" w:w="90"/>
+              <w:right w:type="dxa" w:w="110"/>
             </w:tcMar>
             <w:vAlign w:val="center"/>
           </w:tcPr>
@@ -2341,10 +2483,10 @@
               <w:right w:val="single" w:color="000000" w:sz="4"/>
             </w:tcBorders>
             <w:tcMar>
-              <w:top w:type="dxa" w:w="80"/>
-              <w:left w:type="dxa" w:w="100"/>
-              <w:bottom w:type="dxa" w:w="80"/>
-              <w:right w:type="dxa" w:w="100"/>
+              <w:top w:type="dxa" w:w="90"/>
+              <w:left w:type="dxa" w:w="110"/>
+              <w:bottom w:type="dxa" w:w="90"/>
+              <w:right w:type="dxa" w:w="110"/>
             </w:tcMar>
             <w:vAlign w:val="center"/>
           </w:tcPr>
@@ -2373,25 +2515,25 @@
               <w:right w:val="single" w:color="000000" w:sz="4"/>
             </w:tcBorders>
             <w:tcMar>
-              <w:top w:type="dxa" w:w="80"/>
-              <w:left w:type="dxa" w:w="100"/>
-              <w:bottom w:type="dxa" w:w="80"/>
-              <w:right w:type="dxa" w:w="100"/>
-            </w:tcMar>
-            <w:vAlign w:val="center"/>
-          </w:tcPr>
-          <w:p>
-            <w:pPr>
-              <w:jc w:val="left"/>
-            </w:pPr>
-            <w:r>
-              <w:rPr>
-                <w:b w:val="false"/>
-                <w:bCs w:val="false"/>
-                <w:sz w:val="19"/>
-                <w:szCs w:val="19"/>
-              </w:rPr>
-              <w:t xml:space="preserve">pythonocc-core (OCCT)</w:t>
+              <w:top w:type="dxa" w:w="90"/>
+              <w:left w:type="dxa" w:w="110"/>
+              <w:bottom w:type="dxa" w:w="90"/>
+              <w:right w:type="dxa" w:w="110"/>
+            </w:tcMar>
+            <w:vAlign w:val="center"/>
+          </w:tcPr>
+          <w:p>
+            <w:pPr>
+              <w:jc w:val="left"/>
+            </w:pPr>
+            <w:r>
+              <w:rPr>
+                <w:b w:val="false"/>
+                <w:bCs w:val="false"/>
+                <w:sz w:val="19"/>
+                <w:szCs w:val="19"/>
+              </w:rPr>
+              <w:t xml:space="preserve">OCCT-based (candidates: FreeCAD-python API, cadquery)</w:t>
             </w:r>
           </w:p>
         </w:tc>
@@ -2405,25 +2547,25 @@
               <w:right w:val="single" w:color="000000" w:sz="4"/>
             </w:tcBorders>
             <w:tcMar>
-              <w:top w:type="dxa" w:w="80"/>
-              <w:left w:type="dxa" w:w="100"/>
-              <w:bottom w:type="dxa" w:w="80"/>
-              <w:right w:type="dxa" w:w="100"/>
-            </w:tcMar>
-            <w:vAlign w:val="center"/>
-          </w:tcPr>
-          <w:p>
-            <w:pPr>
-              <w:jc w:val="left"/>
-            </w:pPr>
-            <w:r>
-              <w:rPr>
-                <w:b w:val="false"/>
-                <w:bCs w:val="false"/>
-                <w:sz w:val="19"/>
-                <w:szCs w:val="19"/>
-              </w:rPr>
-              <w:t xml:space="preserve">Confirmed (HP mentor validated)</w:t>
+              <w:top w:type="dxa" w:w="90"/>
+              <w:left w:type="dxa" w:w="110"/>
+              <w:bottom w:type="dxa" w:w="90"/>
+              <w:right w:type="dxa" w:w="110"/>
+            </w:tcMar>
+            <w:vAlign w:val="center"/>
+          </w:tcPr>
+          <w:p>
+            <w:pPr>
+              <w:jc w:val="left"/>
+            </w:pPr>
+            <w:r>
+              <w:rPr>
+                <w:b w:val="false"/>
+                <w:bCs w:val="false"/>
+                <w:sz w:val="19"/>
+                <w:szCs w:val="19"/>
+              </w:rPr>
+              <w:t xml:space="preserve">Approach confirmed (no NX); exact binding open</w:t>
             </w:r>
           </w:p>
         </w:tc>
@@ -2439,10 +2581,10 @@
               <w:right w:val="single" w:color="000000" w:sz="4"/>
             </w:tcBorders>
             <w:tcMar>
-              <w:top w:type="dxa" w:w="80"/>
-              <w:left w:type="dxa" w:w="100"/>
-              <w:bottom w:type="dxa" w:w="80"/>
-              <w:right w:type="dxa" w:w="100"/>
+              <w:top w:type="dxa" w:w="90"/>
+              <w:left w:type="dxa" w:w="110"/>
+              <w:bottom w:type="dxa" w:w="90"/>
+              <w:right w:type="dxa" w:w="110"/>
             </w:tcMar>
             <w:vAlign w:val="center"/>
           </w:tcPr>
@@ -2471,10 +2613,10 @@
               <w:right w:val="single" w:color="000000" w:sz="4"/>
             </w:tcBorders>
             <w:tcMar>
-              <w:top w:type="dxa" w:w="80"/>
-              <w:left w:type="dxa" w:w="100"/>
-              <w:bottom w:type="dxa" w:w="80"/>
-              <w:right w:type="dxa" w:w="100"/>
+              <w:top w:type="dxa" w:w="90"/>
+              <w:left w:type="dxa" w:w="110"/>
+              <w:bottom w:type="dxa" w:w="90"/>
+              <w:right w:type="dxa" w:w="110"/>
             </w:tcMar>
             <w:vAlign w:val="center"/>
           </w:tcPr>
@@ -2503,10 +2645,10 @@
               <w:right w:val="single" w:color="000000" w:sz="4"/>
             </w:tcBorders>
             <w:tcMar>
-              <w:top w:type="dxa" w:w="80"/>
-              <w:left w:type="dxa" w:w="100"/>
-              <w:bottom w:type="dxa" w:w="80"/>
-              <w:right w:type="dxa" w:w="100"/>
+              <w:top w:type="dxa" w:w="90"/>
+              <w:left w:type="dxa" w:w="110"/>
+              <w:bottom w:type="dxa" w:w="90"/>
+              <w:right w:type="dxa" w:w="110"/>
             </w:tcMar>
             <w:vAlign w:val="center"/>
           </w:tcPr>
@@ -2537,10 +2679,10 @@
               <w:right w:val="single" w:color="000000" w:sz="4"/>
             </w:tcBorders>
             <w:tcMar>
-              <w:top w:type="dxa" w:w="80"/>
-              <w:left w:type="dxa" w:w="100"/>
-              <w:bottom w:type="dxa" w:w="80"/>
-              <w:right w:type="dxa" w:w="100"/>
+              <w:top w:type="dxa" w:w="90"/>
+              <w:left w:type="dxa" w:w="110"/>
+              <w:bottom w:type="dxa" w:w="90"/>
+              <w:right w:type="dxa" w:w="110"/>
             </w:tcMar>
             <w:vAlign w:val="center"/>
           </w:tcPr>
@@ -2569,10 +2711,10 @@
               <w:right w:val="single" w:color="000000" w:sz="4"/>
             </w:tcBorders>
             <w:tcMar>
-              <w:top w:type="dxa" w:w="80"/>
-              <w:left w:type="dxa" w:w="100"/>
-              <w:bottom w:type="dxa" w:w="80"/>
-              <w:right w:type="dxa" w:w="100"/>
+              <w:top w:type="dxa" w:w="90"/>
+              <w:left w:type="dxa" w:w="110"/>
+              <w:bottom w:type="dxa" w:w="90"/>
+              <w:right w:type="dxa" w:w="110"/>
             </w:tcMar>
             <w:vAlign w:val="center"/>
           </w:tcPr>
@@ -2601,10 +2743,10 @@
               <w:right w:val="single" w:color="000000" w:sz="4"/>
             </w:tcBorders>
             <w:tcMar>
-              <w:top w:type="dxa" w:w="80"/>
-              <w:left w:type="dxa" w:w="100"/>
-              <w:bottom w:type="dxa" w:w="80"/>
-              <w:right w:type="dxa" w:w="100"/>
+              <w:top w:type="dxa" w:w="90"/>
+              <w:left w:type="dxa" w:w="110"/>
+              <w:bottom w:type="dxa" w:w="90"/>
+              <w:right w:type="dxa" w:w="110"/>
             </w:tcMar>
             <w:vAlign w:val="center"/>
           </w:tcPr>
@@ -2635,10 +2777,10 @@
               <w:right w:val="single" w:color="000000" w:sz="4"/>
             </w:tcBorders>
             <w:tcMar>
-              <w:top w:type="dxa" w:w="80"/>
-              <w:left w:type="dxa" w:w="100"/>
-              <w:bottom w:type="dxa" w:w="80"/>
-              <w:right w:type="dxa" w:w="100"/>
+              <w:top w:type="dxa" w:w="90"/>
+              <w:left w:type="dxa" w:w="110"/>
+              <w:bottom w:type="dxa" w:w="90"/>
+              <w:right w:type="dxa" w:w="110"/>
             </w:tcMar>
             <w:vAlign w:val="center"/>
           </w:tcPr>
@@ -2667,10 +2809,10 @@
               <w:right w:val="single" w:color="000000" w:sz="4"/>
             </w:tcBorders>
             <w:tcMar>
-              <w:top w:type="dxa" w:w="80"/>
-              <w:left w:type="dxa" w:w="100"/>
-              <w:bottom w:type="dxa" w:w="80"/>
-              <w:right w:type="dxa" w:w="100"/>
+              <w:top w:type="dxa" w:w="90"/>
+              <w:left w:type="dxa" w:w="110"/>
+              <w:bottom w:type="dxa" w:w="90"/>
+              <w:right w:type="dxa" w:w="110"/>
             </w:tcMar>
             <w:vAlign w:val="center"/>
           </w:tcPr>
@@ -2699,10 +2841,10 @@
               <w:right w:val="single" w:color="000000" w:sz="4"/>
             </w:tcBorders>
             <w:tcMar>
-              <w:top w:type="dxa" w:w="80"/>
-              <w:left w:type="dxa" w:w="100"/>
-              <w:bottom w:type="dxa" w:w="80"/>
-              <w:right w:type="dxa" w:w="100"/>
+              <w:top w:type="dxa" w:w="90"/>
+              <w:left w:type="dxa" w:w="110"/>
+              <w:bottom w:type="dxa" w:w="90"/>
+              <w:right w:type="dxa" w:w="110"/>
             </w:tcMar>
             <w:vAlign w:val="center"/>
           </w:tcPr>
@@ -2733,10 +2875,10 @@
               <w:right w:val="single" w:color="000000" w:sz="4"/>
             </w:tcBorders>
             <w:tcMar>
-              <w:top w:type="dxa" w:w="80"/>
-              <w:left w:type="dxa" w:w="100"/>
-              <w:bottom w:type="dxa" w:w="80"/>
-              <w:right w:type="dxa" w:w="100"/>
+              <w:top w:type="dxa" w:w="90"/>
+              <w:left w:type="dxa" w:w="110"/>
+              <w:bottom w:type="dxa" w:w="90"/>
+              <w:right w:type="dxa" w:w="110"/>
             </w:tcMar>
             <w:vAlign w:val="center"/>
           </w:tcPr>
@@ -2765,10 +2907,10 @@
               <w:right w:val="single" w:color="000000" w:sz="4"/>
             </w:tcBorders>
             <w:tcMar>
-              <w:top w:type="dxa" w:w="80"/>
-              <w:left w:type="dxa" w:w="100"/>
-              <w:bottom w:type="dxa" w:w="80"/>
-              <w:right w:type="dxa" w:w="100"/>
+              <w:top w:type="dxa" w:w="90"/>
+              <w:left w:type="dxa" w:w="110"/>
+              <w:bottom w:type="dxa" w:w="90"/>
+              <w:right w:type="dxa" w:w="110"/>
             </w:tcMar>
             <w:vAlign w:val="center"/>
           </w:tcPr>
@@ -2797,10 +2939,10 @@
               <w:right w:val="single" w:color="000000" w:sz="4"/>
             </w:tcBorders>
             <w:tcMar>
-              <w:top w:type="dxa" w:w="80"/>
-              <w:left w:type="dxa" w:w="100"/>
-              <w:bottom w:type="dxa" w:w="80"/>
-              <w:right w:type="dxa" w:w="100"/>
+              <w:top w:type="dxa" w:w="90"/>
+              <w:left w:type="dxa" w:w="110"/>
+              <w:bottom w:type="dxa" w:w="90"/>
+              <w:right w:type="dxa" w:w="110"/>
             </w:tcMar>
             <w:vAlign w:val="center"/>
           </w:tcPr>
@@ -2831,10 +2973,10 @@
               <w:right w:val="single" w:color="000000" w:sz="4"/>
             </w:tcBorders>
             <w:tcMar>
-              <w:top w:type="dxa" w:w="80"/>
-              <w:left w:type="dxa" w:w="100"/>
-              <w:bottom w:type="dxa" w:w="80"/>
-              <w:right w:type="dxa" w:w="100"/>
+              <w:top w:type="dxa" w:w="90"/>
+              <w:left w:type="dxa" w:w="110"/>
+              <w:bottom w:type="dxa" w:w="90"/>
+              <w:right w:type="dxa" w:w="110"/>
             </w:tcMar>
             <w:vAlign w:val="center"/>
           </w:tcPr>
@@ -2863,10 +3005,10 @@
               <w:right w:val="single" w:color="000000" w:sz="4"/>
             </w:tcBorders>
             <w:tcMar>
-              <w:top w:type="dxa" w:w="80"/>
-              <w:left w:type="dxa" w:w="100"/>
-              <w:bottom w:type="dxa" w:w="80"/>
-              <w:right w:type="dxa" w:w="100"/>
+              <w:top w:type="dxa" w:w="90"/>
+              <w:left w:type="dxa" w:w="110"/>
+              <w:bottom w:type="dxa" w:w="90"/>
+              <w:right w:type="dxa" w:w="110"/>
             </w:tcMar>
             <w:vAlign w:val="center"/>
           </w:tcPr>
@@ -2895,10 +3037,10 @@
               <w:right w:val="single" w:color="000000" w:sz="4"/>
             </w:tcBorders>
             <w:tcMar>
-              <w:top w:type="dxa" w:w="80"/>
-              <w:left w:type="dxa" w:w="100"/>
-              <w:bottom w:type="dxa" w:w="80"/>
-              <w:right w:type="dxa" w:w="100"/>
+              <w:top w:type="dxa" w:w="90"/>
+              <w:left w:type="dxa" w:w="110"/>
+              <w:bottom w:type="dxa" w:w="90"/>
+              <w:right w:type="dxa" w:w="110"/>
             </w:tcMar>
             <w:vAlign w:val="center"/>
           </w:tcPr>

</xml_diff>